<commit_message>
Corrected Task2 DWH_PG module
</commit_message>
<xml_diff>
--- a/DWH_PG_Task2.docx
+++ b/DWH_PG_Task2.docx
@@ -61,7 +61,8 @@
       </w:pPr>
       <w:r>
         <w:rPr>
-          <w:lang w:val="en-GB"/>
+          <w:noProof/>
+          <w:lang w:eastAsia="ru-RU"/>
         </w:rPr>
         <w:drawing>
           <wp:inline distT="0" distB="0" distL="0" distR="0" wp14:anchorId="4391C79B" wp14:editId="10BCC5D6">
@@ -131,7 +132,8 @@
       </w:pPr>
       <w:r>
         <w:rPr>
-          <w:lang w:val="en-GB"/>
+          <w:noProof/>
+          <w:lang w:eastAsia="ru-RU"/>
         </w:rPr>
         <w:drawing>
           <wp:inline distT="0" distB="0" distL="0" distR="0" wp14:anchorId="0E83DF5C" wp14:editId="01D3F11B">
@@ -228,7 +230,8 @@
       </w:pPr>
       <w:r>
         <w:rPr>
-          <w:lang w:val="en-GB"/>
+          <w:noProof/>
+          <w:lang w:eastAsia="ru-RU"/>
         </w:rPr>
         <w:lastRenderedPageBreak/>
         <w:drawing>
@@ -360,7 +363,8 @@
       </w:pPr>
       <w:r>
         <w:rPr>
-          <w:lang w:val="en-GB"/>
+          <w:noProof/>
+          <w:lang w:eastAsia="ru-RU"/>
         </w:rPr>
         <w:drawing>
           <wp:inline distT="0" distB="0" distL="0" distR="0" wp14:anchorId="20A1614F" wp14:editId="6E72DA26">
@@ -657,7 +661,8 @@
       </w:pPr>
       <w:r>
         <w:rPr>
-          <w:lang w:val="en-GB"/>
+          <w:noProof/>
+          <w:lang w:eastAsia="ru-RU"/>
         </w:rPr>
         <w:drawing>
           <wp:inline distT="0" distB="0" distL="0" distR="0" wp14:anchorId="28F75980" wp14:editId="605E97BF">
@@ -719,7 +724,8 @@
       </w:pPr>
       <w:r>
         <w:rPr>
-          <w:lang w:val="en-GB"/>
+          <w:noProof/>
+          <w:lang w:eastAsia="ru-RU"/>
         </w:rPr>
         <w:lastRenderedPageBreak/>
         <w:drawing>
@@ -782,7 +788,8 @@
       </w:pPr>
       <w:r>
         <w:rPr>
-          <w:lang w:val="en-GB"/>
+          <w:noProof/>
+          <w:lang w:eastAsia="ru-RU"/>
         </w:rPr>
         <w:drawing>
           <wp:inline distT="0" distB="0" distL="0" distR="0" wp14:anchorId="7693403E" wp14:editId="4955E4BD">
@@ -925,7 +932,8 @@
       </w:pPr>
       <w:r>
         <w:rPr>
-          <w:lang w:val="en-GB"/>
+          <w:noProof/>
+          <w:lang w:eastAsia="ru-RU"/>
         </w:rPr>
         <w:drawing>
           <wp:inline distT="0" distB="0" distL="0" distR="0" wp14:anchorId="5CE0D6A3" wp14:editId="1BF60A8E">
@@ -1094,9 +1102,10 @@
           <w:rFonts w:ascii="Consolas" w:hAnsi="Consolas"/>
           <w:sz w:val="16"/>
           <w:szCs w:val="16"/>
-        </w:rPr>
-      </w:pPr>
-      <w:proofErr w:type="spellStart"/>
+          <w:lang w:val="en-GB"/>
+        </w:rPr>
+      </w:pPr>
+      <w:proofErr w:type="gramStart"/>
       <w:r>
         <w:rPr>
           <w:rFonts w:ascii="Consolas" w:hAnsi="Consolas"/>
@@ -1104,66 +1113,168 @@
           <w:bCs/>
           <w:sz w:val="16"/>
           <w:szCs w:val="16"/>
+          <w:lang w:val="en-GB"/>
         </w:rPr>
         <w:t>where</w:t>
       </w:r>
+      <w:proofErr w:type="gramEnd"/>
+      <w:r>
+        <w:rPr>
+          <w:rFonts w:ascii="Consolas" w:hAnsi="Consolas"/>
+          <w:sz w:val="16"/>
+          <w:szCs w:val="16"/>
+          <w:lang w:val="en-GB"/>
+        </w:rPr>
+        <w:t xml:space="preserve"> id = </w:t>
+      </w:r>
+      <w:r>
+        <w:rPr>
+          <w:rFonts w:ascii="Consolas" w:hAnsi="Consolas"/>
+          <w:sz w:val="16"/>
+          <w:szCs w:val="16"/>
+          <w:lang w:val="en-GB"/>
+        </w:rPr>
+        <w:t>4</w:t>
+      </w:r>
+      <w:r>
+        <w:rPr>
+          <w:rFonts w:ascii="Consolas" w:hAnsi="Consolas"/>
+          <w:sz w:val="16"/>
+          <w:szCs w:val="16"/>
+          <w:lang w:val="en-GB"/>
+        </w:rPr>
+        <w:t>;</w:t>
+      </w:r>
+    </w:p>
+    <w:p>
+      <w:pPr>
+        <w:pStyle w:val="a5"/>
+        <w:shd w:val="clear" w:color="auto" w:fill="FFFFFF"/>
+        <w:spacing w:before="0" w:beforeAutospacing="0" w:after="0" w:afterAutospacing="0"/>
+        <w:rPr>
+          <w:rFonts w:ascii="Consolas" w:hAnsi="Consolas"/>
+          <w:sz w:val="16"/>
+          <w:szCs w:val="16"/>
+          <w:lang w:val="en-GB"/>
+        </w:rPr>
+      </w:pPr>
+      <w:proofErr w:type="gramStart"/>
+      <w:r>
+        <w:rPr>
+          <w:rFonts w:ascii="Consolas" w:hAnsi="Consolas"/>
+          <w:sz w:val="16"/>
+          <w:szCs w:val="16"/>
+          <w:lang w:val="en-GB"/>
+        </w:rPr>
+        <w:t>commit</w:t>
+      </w:r>
+      <w:proofErr w:type="gramEnd"/>
+      <w:r>
+        <w:rPr>
+          <w:rFonts w:ascii="Consolas" w:hAnsi="Consolas"/>
+          <w:sz w:val="16"/>
+          <w:szCs w:val="16"/>
+          <w:lang w:val="en-GB"/>
+        </w:rPr>
+        <w:t>;</w:t>
+      </w:r>
+    </w:p>
+    <w:p>
+      <w:pPr>
+        <w:pStyle w:val="a5"/>
+        <w:shd w:val="clear" w:color="auto" w:fill="FFFFFF"/>
+        <w:spacing w:before="0" w:beforeAutospacing="0" w:after="0" w:afterAutospacing="0"/>
+        <w:rPr>
+          <w:rFonts w:ascii="Consolas" w:hAnsi="Consolas"/>
+          <w:sz w:val="16"/>
+          <w:szCs w:val="16"/>
+          <w:lang w:val="en-GB"/>
+        </w:rPr>
+      </w:pPr>
+    </w:p>
+    <w:p>
+      <w:pPr>
+        <w:pStyle w:val="a5"/>
+        <w:shd w:val="clear" w:color="auto" w:fill="FFFFFF"/>
+        <w:spacing w:before="0" w:beforeAutospacing="0" w:after="0" w:afterAutospacing="0"/>
+        <w:rPr>
+          <w:rFonts w:ascii="Consolas" w:hAnsi="Consolas"/>
+          <w:sz w:val="16"/>
+          <w:szCs w:val="16"/>
+          <w:lang w:val="en-GB"/>
+        </w:rPr>
+      </w:pPr>
+      <w:r>
+        <w:rPr>
+          <w:rFonts w:ascii="Consolas" w:hAnsi="Consolas"/>
+          <w:sz w:val="16"/>
+          <w:szCs w:val="16"/>
+          <w:lang w:val="en-GB"/>
+        </w:rPr>
+        <w:t xml:space="preserve">Isolation level –read </w:t>
+      </w:r>
+      <w:proofErr w:type="spellStart"/>
+      <w:r>
+        <w:rPr>
+          <w:rFonts w:ascii="Consolas" w:hAnsi="Consolas"/>
+          <w:sz w:val="16"/>
+          <w:szCs w:val="16"/>
+          <w:lang w:val="en-GB"/>
+        </w:rPr>
+        <w:t>commited</w:t>
+      </w:r>
       <w:proofErr w:type="spellEnd"/>
       <w:r>
         <w:rPr>
           <w:rFonts w:ascii="Consolas" w:hAnsi="Consolas"/>
           <w:sz w:val="16"/>
           <w:szCs w:val="16"/>
+          <w:lang w:val="en-GB"/>
+        </w:rPr>
+        <w:t xml:space="preserve">. </w:t>
+      </w:r>
+    </w:p>
+    <w:p>
+      <w:pPr>
+        <w:pStyle w:val="a5"/>
+        <w:shd w:val="clear" w:color="auto" w:fill="FFFFFF"/>
+        <w:spacing w:before="0" w:beforeAutospacing="0" w:after="0" w:afterAutospacing="0"/>
+        <w:rPr>
+          <w:rFonts w:ascii="Consolas" w:hAnsi="Consolas"/>
+          <w:sz w:val="16"/>
+          <w:szCs w:val="16"/>
+          <w:lang w:val="en-GB"/>
+        </w:rPr>
+      </w:pPr>
+      <w:r>
+        <w:rPr>
+          <w:rFonts w:ascii="Consolas" w:hAnsi="Consolas"/>
+          <w:sz w:val="16"/>
+          <w:szCs w:val="16"/>
+          <w:lang w:val="en-GB"/>
+        </w:rPr>
+        <w:t xml:space="preserve">The same transaction, the second select after </w:t>
+      </w:r>
+      <w:proofErr w:type="spellStart"/>
+      <w:r>
+        <w:rPr>
+          <w:rFonts w:ascii="Consolas" w:hAnsi="Consolas"/>
+          <w:sz w:val="16"/>
+          <w:szCs w:val="16"/>
+          <w:lang w:val="en-GB"/>
+        </w:rPr>
+        <w:t>commited</w:t>
+      </w:r>
+      <w:proofErr w:type="spellEnd"/>
+      <w:r>
+        <w:rPr>
+          <w:rFonts w:ascii="Consolas" w:hAnsi="Consolas"/>
+          <w:sz w:val="16"/>
+          <w:szCs w:val="16"/>
+          <w:lang w:val="en-GB"/>
         </w:rPr>
         <w:t xml:space="preserve"> </w:t>
       </w:r>
-      <w:proofErr w:type="spellStart"/>
-      <w:r>
-        <w:rPr>
-          <w:rFonts w:ascii="Consolas" w:hAnsi="Consolas"/>
-          <w:sz w:val="16"/>
-          <w:szCs w:val="16"/>
-        </w:rPr>
-        <w:t>id</w:t>
-      </w:r>
-      <w:proofErr w:type="spellEnd"/>
-      <w:r>
-        <w:rPr>
-          <w:rFonts w:ascii="Consolas" w:hAnsi="Consolas"/>
-          <w:sz w:val="16"/>
-          <w:szCs w:val="16"/>
-        </w:rPr>
-        <w:t xml:space="preserve"> = </w:t>
-      </w:r>
-      <w:r>
-        <w:rPr>
-          <w:rFonts w:ascii="Consolas" w:hAnsi="Consolas"/>
-          <w:sz w:val="16"/>
-          <w:szCs w:val="16"/>
-          <w:lang w:val="en-GB"/>
-        </w:rPr>
-        <w:t>4</w:t>
-      </w:r>
-      <w:r>
-        <w:rPr>
-          <w:rFonts w:ascii="Consolas" w:hAnsi="Consolas"/>
-          <w:sz w:val="16"/>
-          <w:szCs w:val="16"/>
-        </w:rPr>
-        <w:t>;</w:t>
-      </w:r>
-    </w:p>
-    <w:p>
-      <w:pPr>
-        <w:pStyle w:val="a5"/>
-        <w:shd w:val="clear" w:color="auto" w:fill="FFFFFF"/>
-        <w:spacing w:before="0" w:beforeAutospacing="0" w:after="0" w:afterAutospacing="0"/>
-        <w:rPr>
-          <w:rFonts w:ascii="Consolas" w:hAnsi="Consolas"/>
-          <w:sz w:val="16"/>
-          <w:szCs w:val="16"/>
-          <w:lang w:val="en-GB"/>
-        </w:rPr>
-      </w:pPr>
       <w:proofErr w:type="gramStart"/>
       <w:r>
         <w:rPr>
@@ -1172,7 +1283,7 @@
           <w:szCs w:val="16"/>
           <w:lang w:val="en-GB"/>
         </w:rPr>
-        <w:t>commit</w:t>
+        <w:t>update .</w:t>
       </w:r>
       <w:proofErr w:type="gramEnd"/>
       <w:r>
@@ -1182,123 +1293,6 @@
           <w:szCs w:val="16"/>
           <w:lang w:val="en-GB"/>
         </w:rPr>
-        <w:t>;</w:t>
-      </w:r>
-    </w:p>
-    <w:p>
-      <w:pPr>
-        <w:pStyle w:val="a5"/>
-        <w:shd w:val="clear" w:color="auto" w:fill="FFFFFF"/>
-        <w:spacing w:before="0" w:beforeAutospacing="0" w:after="0" w:afterAutospacing="0"/>
-        <w:rPr>
-          <w:rFonts w:ascii="Consolas" w:hAnsi="Consolas"/>
-          <w:sz w:val="16"/>
-          <w:szCs w:val="16"/>
-          <w:lang w:val="en-GB"/>
-        </w:rPr>
-      </w:pPr>
-    </w:p>
-    <w:p>
-      <w:pPr>
-        <w:pStyle w:val="a5"/>
-        <w:shd w:val="clear" w:color="auto" w:fill="FFFFFF"/>
-        <w:spacing w:before="0" w:beforeAutospacing="0" w:after="0" w:afterAutospacing="0"/>
-        <w:rPr>
-          <w:rFonts w:ascii="Consolas" w:hAnsi="Consolas"/>
-          <w:sz w:val="16"/>
-          <w:szCs w:val="16"/>
-          <w:lang w:val="en-GB"/>
-        </w:rPr>
-      </w:pPr>
-      <w:r>
-        <w:rPr>
-          <w:rFonts w:ascii="Consolas" w:hAnsi="Consolas"/>
-          <w:sz w:val="16"/>
-          <w:szCs w:val="16"/>
-          <w:lang w:val="en-GB"/>
-        </w:rPr>
-        <w:t xml:space="preserve">Isolation level –read </w:t>
-      </w:r>
-      <w:proofErr w:type="spellStart"/>
-      <w:r>
-        <w:rPr>
-          <w:rFonts w:ascii="Consolas" w:hAnsi="Consolas"/>
-          <w:sz w:val="16"/>
-          <w:szCs w:val="16"/>
-          <w:lang w:val="en-GB"/>
-        </w:rPr>
-        <w:t>commited</w:t>
-      </w:r>
-      <w:proofErr w:type="spellEnd"/>
-      <w:r>
-        <w:rPr>
-          <w:rFonts w:ascii="Consolas" w:hAnsi="Consolas"/>
-          <w:sz w:val="16"/>
-          <w:szCs w:val="16"/>
-          <w:lang w:val="en-GB"/>
-        </w:rPr>
-        <w:t xml:space="preserve">. </w:t>
-      </w:r>
-    </w:p>
-    <w:p>
-      <w:pPr>
-        <w:pStyle w:val="a5"/>
-        <w:shd w:val="clear" w:color="auto" w:fill="FFFFFF"/>
-        <w:spacing w:before="0" w:beforeAutospacing="0" w:after="0" w:afterAutospacing="0"/>
-        <w:rPr>
-          <w:rFonts w:ascii="Consolas" w:hAnsi="Consolas"/>
-          <w:sz w:val="16"/>
-          <w:szCs w:val="16"/>
-          <w:lang w:val="en-GB"/>
-        </w:rPr>
-      </w:pPr>
-      <w:r>
-        <w:rPr>
-          <w:rFonts w:ascii="Consolas" w:hAnsi="Consolas"/>
-          <w:sz w:val="16"/>
-          <w:szCs w:val="16"/>
-          <w:lang w:val="en-GB"/>
-        </w:rPr>
-        <w:t xml:space="preserve">The same transaction, the second select after </w:t>
-      </w:r>
-      <w:proofErr w:type="spellStart"/>
-      <w:r>
-        <w:rPr>
-          <w:rFonts w:ascii="Consolas" w:hAnsi="Consolas"/>
-          <w:sz w:val="16"/>
-          <w:szCs w:val="16"/>
-          <w:lang w:val="en-GB"/>
-        </w:rPr>
-        <w:t>commited</w:t>
-      </w:r>
-      <w:proofErr w:type="spellEnd"/>
-      <w:r>
-        <w:rPr>
-          <w:rFonts w:ascii="Consolas" w:hAnsi="Consolas"/>
-          <w:sz w:val="16"/>
-          <w:szCs w:val="16"/>
-          <w:lang w:val="en-GB"/>
-        </w:rPr>
-        <w:t xml:space="preserve"> </w:t>
-      </w:r>
-      <w:proofErr w:type="gramStart"/>
-      <w:r>
-        <w:rPr>
-          <w:rFonts w:ascii="Consolas" w:hAnsi="Consolas"/>
-          <w:sz w:val="16"/>
-          <w:szCs w:val="16"/>
-          <w:lang w:val="en-GB"/>
-        </w:rPr>
-        <w:t>update .</w:t>
-      </w:r>
-      <w:proofErr w:type="gramEnd"/>
-      <w:r>
-        <w:rPr>
-          <w:rFonts w:ascii="Consolas" w:hAnsi="Consolas"/>
-          <w:sz w:val="16"/>
-          <w:szCs w:val="16"/>
-          <w:lang w:val="en-GB"/>
-        </w:rPr>
         <w:t xml:space="preserve"> Status updated.</w:t>
       </w:r>
     </w:p>
@@ -1330,9 +1324,9 @@
       <w:r>
         <w:rPr>
           <w:rFonts w:ascii="Consolas" w:hAnsi="Consolas"/>
-          <w:sz w:val="16"/>
-          <w:szCs w:val="16"/>
-          <w:lang w:val="en-GB"/>
+          <w:noProof/>
+          <w:sz w:val="16"/>
+          <w:szCs w:val="16"/>
         </w:rPr>
         <w:drawing>
           <wp:inline distT="0" distB="0" distL="0" distR="0" wp14:anchorId="039B8A85" wp14:editId="7FC9425C">
@@ -1461,9 +1455,9 @@
       <w:r>
         <w:rPr>
           <w:rFonts w:ascii="Consolas" w:hAnsi="Consolas"/>
-          <w:sz w:val="16"/>
-          <w:szCs w:val="16"/>
-          <w:lang w:val="en-GB"/>
+          <w:noProof/>
+          <w:sz w:val="16"/>
+          <w:szCs w:val="16"/>
         </w:rPr>
         <w:drawing>
           <wp:inline distT="0" distB="0" distL="0" distR="0" wp14:anchorId="2DE89840" wp14:editId="7F42ACE2">
@@ -1556,20 +1550,8 @@
           <w:szCs w:val="16"/>
           <w:lang w:val="en-GB"/>
         </w:rPr>
-        <w:t xml:space="preserve"> level- </w:t>
-      </w:r>
-      <w:r>
-        <w:rPr>
-          <w:rFonts w:ascii="Consolas" w:hAnsi="Consolas"/>
-          <w:b/>
-          <w:sz w:val="16"/>
-          <w:szCs w:val="16"/>
-          <w:lang w:val="en-GB"/>
-        </w:rPr>
-        <w:t>repeatable read</w:t>
-      </w:r>
-      <w:bookmarkStart w:id="0" w:name="_GoBack"/>
-      <w:bookmarkEnd w:id="0"/>
+        <w:t xml:space="preserve"> level- repeatable read</w:t>
+      </w:r>
     </w:p>
     <w:p>
       <w:pPr>
@@ -3459,6 +3441,7 @@
           <w:color w:val="FF0000"/>
           <w:sz w:val="16"/>
           <w:szCs w:val="16"/>
+          <w:lang w:val="en-GB"/>
         </w:rPr>
       </w:pPr>
       <w:r>
@@ -3469,6 +3452,7 @@
           <w:color w:val="800000"/>
           <w:sz w:val="16"/>
           <w:szCs w:val="16"/>
+          <w:lang w:val="en-GB"/>
         </w:rPr>
         <w:t>COMMIT</w:t>
       </w:r>
@@ -3478,6 +3462,7 @@
           <w:color w:val="FF0000"/>
           <w:sz w:val="16"/>
           <w:szCs w:val="16"/>
+          <w:lang w:val="en-GB"/>
         </w:rPr>
         <w:t>;</w:t>
       </w:r>
@@ -3492,6 +3477,7 @@
           <w:color w:val="FF0000"/>
           <w:sz w:val="16"/>
           <w:szCs w:val="16"/>
+          <w:lang w:val="en-GB"/>
         </w:rPr>
       </w:pPr>
     </w:p>
@@ -3554,9 +3540,9 @@
       <w:r>
         <w:rPr>
           <w:rFonts w:ascii="Consolas" w:hAnsi="Consolas"/>
-          <w:sz w:val="16"/>
-          <w:szCs w:val="16"/>
-          <w:lang w:val="en-GB"/>
+          <w:noProof/>
+          <w:sz w:val="16"/>
+          <w:szCs w:val="16"/>
         </w:rPr>
         <w:drawing>
           <wp:inline distT="0" distB="0" distL="0" distR="0" wp14:anchorId="348C722C" wp14:editId="25939350">
@@ -3610,9 +3596,9 @@
       <w:r>
         <w:rPr>
           <w:rFonts w:ascii="Consolas" w:hAnsi="Consolas"/>
-          <w:sz w:val="16"/>
-          <w:szCs w:val="16"/>
-          <w:lang w:val="en-GB"/>
+          <w:noProof/>
+          <w:sz w:val="16"/>
+          <w:szCs w:val="16"/>
         </w:rPr>
         <w:drawing>
           <wp:inline distT="0" distB="0" distL="0" distR="0" wp14:anchorId="1007B873" wp14:editId="75E29EBB">
@@ -3692,16 +3678,7 @@
           <w:szCs w:val="16"/>
           <w:lang w:val="en-GB"/>
         </w:rPr>
-        <w:t xml:space="preserve"> </w:t>
-      </w:r>
-      <w:r>
-        <w:rPr>
-          <w:rFonts w:ascii="Consolas" w:hAnsi="Consolas"/>
-          <w:sz w:val="16"/>
-          <w:szCs w:val="16"/>
-          <w:lang w:val="en-GB"/>
-        </w:rPr>
-        <w:t>SERIALIZABLE</w:t>
+        <w:t xml:space="preserve"> SERIALIZABLE</w:t>
       </w:r>
     </w:p>
     <w:p>
@@ -3982,6 +3959,7 @@
       <w:r>
         <w:rPr>
           <w:rFonts w:ascii="Courier New" w:hAnsi="Courier New" w:cs="Courier New"/>
+          <w:noProof/>
           <w:sz w:val="20"/>
           <w:szCs w:val="20"/>
         </w:rPr>
@@ -4224,7 +4202,8 @@
       </w:pPr>
       <w:r>
         <w:rPr>
-          <w:lang w:val="en-GB"/>
+          <w:noProof/>
+          <w:lang w:eastAsia="ru-RU"/>
         </w:rPr>
         <w:lastRenderedPageBreak/>
         <w:drawing>
@@ -4276,6 +4255,574 @@
         </w:rPr>
         <w:t>Locked data</w:t>
       </w:r>
+    </w:p>
+    <w:p>
+      <w:pPr>
+        <w:rPr>
+          <w:lang w:val="en-GB"/>
+        </w:rPr>
+      </w:pPr>
+    </w:p>
+    <w:p>
+      <w:pPr>
+        <w:rPr>
+          <w:lang w:val="en-GB"/>
+        </w:rPr>
+      </w:pPr>
+      <w:r>
+        <w:rPr>
+          <w:lang w:val="en-GB"/>
+        </w:rPr>
+        <w:t>Part 3</w:t>
+      </w:r>
+    </w:p>
+    <w:p>
+      <w:pPr>
+        <w:rPr>
+          <w:lang w:val="en-GB"/>
+        </w:rPr>
+      </w:pPr>
+      <w:r>
+        <w:rPr>
+          <w:lang w:val="en-GB"/>
+        </w:rPr>
+        <w:t>Before commit in the left part</w:t>
+      </w:r>
+    </w:p>
+    <w:p>
+      <w:pPr>
+        <w:rPr>
+          <w:lang w:val="en-GB"/>
+        </w:rPr>
+      </w:pPr>
+      <w:r>
+        <w:rPr>
+          <w:lang w:val="en-GB"/>
+        </w:rPr>
+        <w:drawing>
+          <wp:inline distT="0" distB="0" distL="0" distR="0" wp14:anchorId="691E255A" wp14:editId="635AD9FA">
+            <wp:extent cx="5731510" cy="1835785"/>
+            <wp:effectExtent l="0" t="0" r="2540" b="0"/>
+            <wp:docPr id="11" name="Рисунок 11"/>
+            <wp:cNvGraphicFramePr>
+              <a:graphicFrameLocks xmlns:a="http://schemas.openxmlformats.org/drawingml/2006/main" noChangeAspect="1"/>
+            </wp:cNvGraphicFramePr>
+            <a:graphic xmlns:a="http://schemas.openxmlformats.org/drawingml/2006/main">
+              <a:graphicData uri="http://schemas.openxmlformats.org/drawingml/2006/picture">
+                <pic:pic xmlns:pic="http://schemas.openxmlformats.org/drawingml/2006/picture">
+                  <pic:nvPicPr>
+                    <pic:cNvPr id="1" name=""/>
+                    <pic:cNvPicPr/>
+                  </pic:nvPicPr>
+                  <pic:blipFill>
+                    <a:blip r:embed="rId19"/>
+                    <a:stretch>
+                      <a:fillRect/>
+                    </a:stretch>
+                  </pic:blipFill>
+                  <pic:spPr>
+                    <a:xfrm>
+                      <a:off x="0" y="0"/>
+                      <a:ext cx="5731510" cy="1835785"/>
+                    </a:xfrm>
+                    <a:prstGeom prst="rect">
+                      <a:avLst/>
+                    </a:prstGeom>
+                  </pic:spPr>
+                </pic:pic>
+              </a:graphicData>
+            </a:graphic>
+          </wp:inline>
+        </w:drawing>
+      </w:r>
+    </w:p>
+    <w:p>
+      <w:pPr>
+        <w:rPr>
+          <w:lang w:val="en-GB"/>
+        </w:rPr>
+      </w:pPr>
+      <w:r>
+        <w:rPr>
+          <w:lang w:val="en-GB"/>
+        </w:rPr>
+        <w:t>After commit in the left part</w:t>
+      </w:r>
+    </w:p>
+    <w:p>
+      <w:pPr>
+        <w:rPr>
+          <w:lang w:val="en-GB"/>
+        </w:rPr>
+      </w:pPr>
+      <w:r>
+        <w:rPr>
+          <w:lang w:val="en-GB"/>
+        </w:rPr>
+        <w:drawing>
+          <wp:inline distT="0" distB="0" distL="0" distR="0" wp14:anchorId="03D9AA1E" wp14:editId="456008CB">
+            <wp:extent cx="5731510" cy="1642110"/>
+            <wp:effectExtent l="0" t="0" r="2540" b="0"/>
+            <wp:docPr id="16" name="Рисунок 16"/>
+            <wp:cNvGraphicFramePr>
+              <a:graphicFrameLocks xmlns:a="http://schemas.openxmlformats.org/drawingml/2006/main" noChangeAspect="1"/>
+            </wp:cNvGraphicFramePr>
+            <a:graphic xmlns:a="http://schemas.openxmlformats.org/drawingml/2006/main">
+              <a:graphicData uri="http://schemas.openxmlformats.org/drawingml/2006/picture">
+                <pic:pic xmlns:pic="http://schemas.openxmlformats.org/drawingml/2006/picture">
+                  <pic:nvPicPr>
+                    <pic:cNvPr id="1" name=""/>
+                    <pic:cNvPicPr/>
+                  </pic:nvPicPr>
+                  <pic:blipFill>
+                    <a:blip r:embed="rId20"/>
+                    <a:stretch>
+                      <a:fillRect/>
+                    </a:stretch>
+                  </pic:blipFill>
+                  <pic:spPr>
+                    <a:xfrm>
+                      <a:off x="0" y="0"/>
+                      <a:ext cx="5731510" cy="1642110"/>
+                    </a:xfrm>
+                    <a:prstGeom prst="rect">
+                      <a:avLst/>
+                    </a:prstGeom>
+                  </pic:spPr>
+                </pic:pic>
+              </a:graphicData>
+            </a:graphic>
+          </wp:inline>
+        </w:drawing>
+      </w:r>
+    </w:p>
+    <w:p>
+      <w:pPr>
+        <w:rPr>
+          <w:lang w:val="en-GB"/>
+        </w:rPr>
+      </w:pPr>
+    </w:p>
+    <w:p>
+      <w:pPr>
+        <w:rPr>
+          <w:lang w:val="en-GB"/>
+        </w:rPr>
+      </w:pPr>
+      <w:r>
+        <w:rPr>
+          <w:lang w:val="en-GB"/>
+        </w:rPr>
+        <w:t>Second test</w:t>
+      </w:r>
+    </w:p>
+    <w:p>
+      <w:pPr>
+        <w:rPr>
+          <w:lang w:val="en-GB"/>
+        </w:rPr>
+      </w:pPr>
+      <w:r>
+        <w:rPr>
+          <w:lang w:val="en-GB"/>
+        </w:rPr>
+        <w:lastRenderedPageBreak/>
+        <w:drawing>
+          <wp:inline distT="0" distB="0" distL="0" distR="0" wp14:anchorId="56438770" wp14:editId="1F816C96">
+            <wp:extent cx="5731510" cy="2014855"/>
+            <wp:effectExtent l="0" t="0" r="2540" b="4445"/>
+            <wp:docPr id="17" name="Рисунок 17"/>
+            <wp:cNvGraphicFramePr>
+              <a:graphicFrameLocks xmlns:a="http://schemas.openxmlformats.org/drawingml/2006/main" noChangeAspect="1"/>
+            </wp:cNvGraphicFramePr>
+            <a:graphic xmlns:a="http://schemas.openxmlformats.org/drawingml/2006/main">
+              <a:graphicData uri="http://schemas.openxmlformats.org/drawingml/2006/picture">
+                <pic:pic xmlns:pic="http://schemas.openxmlformats.org/drawingml/2006/picture">
+                  <pic:nvPicPr>
+                    <pic:cNvPr id="1" name=""/>
+                    <pic:cNvPicPr/>
+                  </pic:nvPicPr>
+                  <pic:blipFill>
+                    <a:blip r:embed="rId21"/>
+                    <a:stretch>
+                      <a:fillRect/>
+                    </a:stretch>
+                  </pic:blipFill>
+                  <pic:spPr>
+                    <a:xfrm>
+                      <a:off x="0" y="0"/>
+                      <a:ext cx="5731510" cy="2014855"/>
+                    </a:xfrm>
+                    <a:prstGeom prst="rect">
+                      <a:avLst/>
+                    </a:prstGeom>
+                  </pic:spPr>
+                </pic:pic>
+              </a:graphicData>
+            </a:graphic>
+          </wp:inline>
+        </w:drawing>
+      </w:r>
+    </w:p>
+    <w:p>
+      <w:pPr>
+        <w:rPr>
+          <w:lang w:val="en-GB"/>
+        </w:rPr>
+      </w:pPr>
+      <w:r>
+        <w:rPr>
+          <w:lang w:val="en-GB"/>
+        </w:rPr>
+        <w:t>After commit in right part</w:t>
+      </w:r>
+    </w:p>
+    <w:p>
+      <w:pPr>
+        <w:rPr>
+          <w:lang w:val="en-GB"/>
+        </w:rPr>
+      </w:pPr>
+      <w:r>
+        <w:rPr>
+          <w:lang w:val="en-GB"/>
+        </w:rPr>
+        <w:drawing>
+          <wp:inline distT="0" distB="0" distL="0" distR="0" wp14:anchorId="7773924F" wp14:editId="2A4606CC">
+            <wp:extent cx="5731510" cy="1810385"/>
+            <wp:effectExtent l="0" t="0" r="2540" b="0"/>
+            <wp:docPr id="18" name="Рисунок 18"/>
+            <wp:cNvGraphicFramePr>
+              <a:graphicFrameLocks xmlns:a="http://schemas.openxmlformats.org/drawingml/2006/main" noChangeAspect="1"/>
+            </wp:cNvGraphicFramePr>
+            <a:graphic xmlns:a="http://schemas.openxmlformats.org/drawingml/2006/main">
+              <a:graphicData uri="http://schemas.openxmlformats.org/drawingml/2006/picture">
+                <pic:pic xmlns:pic="http://schemas.openxmlformats.org/drawingml/2006/picture">
+                  <pic:nvPicPr>
+                    <pic:cNvPr id="1" name=""/>
+                    <pic:cNvPicPr/>
+                  </pic:nvPicPr>
+                  <pic:blipFill>
+                    <a:blip r:embed="rId22"/>
+                    <a:stretch>
+                      <a:fillRect/>
+                    </a:stretch>
+                  </pic:blipFill>
+                  <pic:spPr>
+                    <a:xfrm>
+                      <a:off x="0" y="0"/>
+                      <a:ext cx="5731510" cy="1810385"/>
+                    </a:xfrm>
+                    <a:prstGeom prst="rect">
+                      <a:avLst/>
+                    </a:prstGeom>
+                  </pic:spPr>
+                </pic:pic>
+              </a:graphicData>
+            </a:graphic>
+          </wp:inline>
+        </w:drawing>
+      </w:r>
+    </w:p>
+    <w:p>
+      <w:pPr>
+        <w:rPr>
+          <w:lang w:val="en-GB"/>
+        </w:rPr>
+      </w:pPr>
+      <w:proofErr w:type="gramStart"/>
+      <w:r>
+        <w:rPr>
+          <w:lang w:val="en-GB"/>
+        </w:rPr>
+        <w:t>3</w:t>
+      </w:r>
+      <w:r>
+        <w:rPr>
+          <w:vertAlign w:val="superscript"/>
+          <w:lang w:val="en-GB"/>
+        </w:rPr>
+        <w:t>rd</w:t>
+      </w:r>
+      <w:proofErr w:type="gramEnd"/>
+      <w:r>
+        <w:rPr>
+          <w:lang w:val="en-GB"/>
+        </w:rPr>
+        <w:t xml:space="preserve"> test</w:t>
+      </w:r>
+    </w:p>
+    <w:p>
+      <w:pPr>
+        <w:rPr>
+          <w:lang w:val="en-GB"/>
+        </w:rPr>
+      </w:pPr>
+      <w:r>
+        <w:rPr>
+          <w:lang w:val="en-GB"/>
+        </w:rPr>
+        <w:drawing>
+          <wp:inline distT="0" distB="0" distL="0" distR="0" wp14:anchorId="7529BC2A" wp14:editId="5F6BB8EA">
+            <wp:extent cx="5731510" cy="1870710"/>
+            <wp:effectExtent l="0" t="0" r="2540" b="0"/>
+            <wp:docPr id="19" name="Рисунок 19"/>
+            <wp:cNvGraphicFramePr>
+              <a:graphicFrameLocks xmlns:a="http://schemas.openxmlformats.org/drawingml/2006/main" noChangeAspect="1"/>
+            </wp:cNvGraphicFramePr>
+            <a:graphic xmlns:a="http://schemas.openxmlformats.org/drawingml/2006/main">
+              <a:graphicData uri="http://schemas.openxmlformats.org/drawingml/2006/picture">
+                <pic:pic xmlns:pic="http://schemas.openxmlformats.org/drawingml/2006/picture">
+                  <pic:nvPicPr>
+                    <pic:cNvPr id="1" name=""/>
+                    <pic:cNvPicPr/>
+                  </pic:nvPicPr>
+                  <pic:blipFill>
+                    <a:blip r:embed="rId23"/>
+                    <a:stretch>
+                      <a:fillRect/>
+                    </a:stretch>
+                  </pic:blipFill>
+                  <pic:spPr>
+                    <a:xfrm>
+                      <a:off x="0" y="0"/>
+                      <a:ext cx="5731510" cy="1870710"/>
+                    </a:xfrm>
+                    <a:prstGeom prst="rect">
+                      <a:avLst/>
+                    </a:prstGeom>
+                  </pic:spPr>
+                </pic:pic>
+              </a:graphicData>
+            </a:graphic>
+          </wp:inline>
+        </w:drawing>
+      </w:r>
+    </w:p>
+    <w:p>
+      <w:pPr>
+        <w:rPr>
+          <w:lang w:val="en-GB"/>
+        </w:rPr>
+      </w:pPr>
+      <w:r>
+        <w:rPr>
+          <w:lang w:val="en-GB"/>
+        </w:rPr>
+        <w:t>Before commit</w:t>
+      </w:r>
+    </w:p>
+    <w:p>
+      <w:pPr>
+        <w:rPr>
+          <w:lang w:val="en-GB"/>
+        </w:rPr>
+      </w:pPr>
+      <w:r>
+        <w:rPr>
+          <w:lang w:val="en-GB"/>
+        </w:rPr>
+        <w:drawing>
+          <wp:inline distT="0" distB="0" distL="0" distR="0" wp14:anchorId="43B29928" wp14:editId="21E0CE5E">
+            <wp:extent cx="5731510" cy="1715770"/>
+            <wp:effectExtent l="0" t="0" r="2540" b="0"/>
+            <wp:docPr id="20" name="Рисунок 20"/>
+            <wp:cNvGraphicFramePr>
+              <a:graphicFrameLocks xmlns:a="http://schemas.openxmlformats.org/drawingml/2006/main" noChangeAspect="1"/>
+            </wp:cNvGraphicFramePr>
+            <a:graphic xmlns:a="http://schemas.openxmlformats.org/drawingml/2006/main">
+              <a:graphicData uri="http://schemas.openxmlformats.org/drawingml/2006/picture">
+                <pic:pic xmlns:pic="http://schemas.openxmlformats.org/drawingml/2006/picture">
+                  <pic:nvPicPr>
+                    <pic:cNvPr id="1" name=""/>
+                    <pic:cNvPicPr/>
+                  </pic:nvPicPr>
+                  <pic:blipFill>
+                    <a:blip r:embed="rId24"/>
+                    <a:stretch>
+                      <a:fillRect/>
+                    </a:stretch>
+                  </pic:blipFill>
+                  <pic:spPr>
+                    <a:xfrm>
+                      <a:off x="0" y="0"/>
+                      <a:ext cx="5731510" cy="1715770"/>
+                    </a:xfrm>
+                    <a:prstGeom prst="rect">
+                      <a:avLst/>
+                    </a:prstGeom>
+                  </pic:spPr>
+                </pic:pic>
+              </a:graphicData>
+            </a:graphic>
+          </wp:inline>
+        </w:drawing>
+      </w:r>
+    </w:p>
+    <w:p>
+      <w:pPr>
+        <w:rPr>
+          <w:lang w:val="en-GB"/>
+        </w:rPr>
+      </w:pPr>
+      <w:r>
+        <w:rPr>
+          <w:lang w:val="en-GB"/>
+        </w:rPr>
+        <w:lastRenderedPageBreak/>
+        <w:t>After</w:t>
+      </w:r>
+    </w:p>
+    <w:p>
+      <w:pPr>
+        <w:rPr>
+          <w:lang w:val="en-GB"/>
+        </w:rPr>
+      </w:pPr>
+      <w:r>
+        <w:rPr>
+          <w:lang w:val="en-GB"/>
+        </w:rPr>
+        <w:drawing>
+          <wp:inline distT="0" distB="0" distL="0" distR="0" wp14:anchorId="2E8ECF34" wp14:editId="4C33E274">
+            <wp:extent cx="5731510" cy="1741170"/>
+            <wp:effectExtent l="0" t="0" r="2540" b="0"/>
+            <wp:docPr id="21" name="Рисунок 21"/>
+            <wp:cNvGraphicFramePr>
+              <a:graphicFrameLocks xmlns:a="http://schemas.openxmlformats.org/drawingml/2006/main" noChangeAspect="1"/>
+            </wp:cNvGraphicFramePr>
+            <a:graphic xmlns:a="http://schemas.openxmlformats.org/drawingml/2006/main">
+              <a:graphicData uri="http://schemas.openxmlformats.org/drawingml/2006/picture">
+                <pic:pic xmlns:pic="http://schemas.openxmlformats.org/drawingml/2006/picture">
+                  <pic:nvPicPr>
+                    <pic:cNvPr id="1" name=""/>
+                    <pic:cNvPicPr/>
+                  </pic:nvPicPr>
+                  <pic:blipFill>
+                    <a:blip r:embed="rId25"/>
+                    <a:stretch>
+                      <a:fillRect/>
+                    </a:stretch>
+                  </pic:blipFill>
+                  <pic:spPr>
+                    <a:xfrm>
+                      <a:off x="0" y="0"/>
+                      <a:ext cx="5731510" cy="1741170"/>
+                    </a:xfrm>
+                    <a:prstGeom prst="rect">
+                      <a:avLst/>
+                    </a:prstGeom>
+                  </pic:spPr>
+                </pic:pic>
+              </a:graphicData>
+            </a:graphic>
+          </wp:inline>
+        </w:drawing>
+      </w:r>
+    </w:p>
+    <w:p>
+      <w:pPr>
+        <w:pStyle w:val="a3"/>
+        <w:rPr>
+          <w:lang w:val="en-GB"/>
+        </w:rPr>
+      </w:pPr>
+      <w:r>
+        <w:rPr>
+          <w:lang w:val="en-GB"/>
+        </w:rPr>
+        <w:t xml:space="preserve">When using the </w:t>
+      </w:r>
+      <w:r>
+        <w:rPr>
+          <w:rStyle w:val="a4"/>
+          <w:lang w:val="en-GB"/>
+        </w:rPr>
+        <w:t>Repeatable Read</w:t>
+      </w:r>
+      <w:r>
+        <w:rPr>
+          <w:lang w:val="en-GB"/>
+        </w:rPr>
+        <w:t xml:space="preserve"> isolation level, you can observe that after committing DML changes in the first transaction, those changes will not be visible in another ongoing transaction — meaning anomalies such as </w:t>
+      </w:r>
+      <w:r>
+        <w:rPr>
+          <w:rStyle w:val="a4"/>
+          <w:lang w:val="en-GB"/>
+        </w:rPr>
+        <w:t>phantom reads</w:t>
+      </w:r>
+      <w:r>
+        <w:rPr>
+          <w:lang w:val="en-GB"/>
+        </w:rPr>
+        <w:t xml:space="preserve"> and </w:t>
+      </w:r>
+      <w:r>
+        <w:rPr>
+          <w:rStyle w:val="a4"/>
+          <w:lang w:val="en-GB"/>
+        </w:rPr>
+        <w:t>non-repeatable reads</w:t>
+      </w:r>
+      <w:r>
+        <w:rPr>
+          <w:lang w:val="en-GB"/>
+        </w:rPr>
+        <w:t xml:space="preserve"> </w:t>
+      </w:r>
+      <w:proofErr w:type="gramStart"/>
+      <w:r>
+        <w:rPr>
+          <w:lang w:val="en-GB"/>
+        </w:rPr>
+        <w:t>are avoided</w:t>
+      </w:r>
+      <w:proofErr w:type="gramEnd"/>
+      <w:r>
+        <w:rPr>
+          <w:lang w:val="en-GB"/>
+        </w:rPr>
+        <w:t>.</w:t>
+      </w:r>
+    </w:p>
+    <w:p>
+      <w:pPr>
+        <w:rPr>
+          <w:lang w:val="en-GB"/>
+        </w:rPr>
+      </w:pPr>
+      <w:bookmarkStart w:id="0" w:name="_GoBack"/>
+      <w:bookmarkEnd w:id="0"/>
+    </w:p>
+    <w:p>
+      <w:pPr>
+        <w:rPr>
+          <w:lang w:val="en-GB"/>
+        </w:rPr>
+      </w:pPr>
+    </w:p>
+    <w:p>
+      <w:pPr>
+        <w:rPr>
+          <w:lang w:val="en-GB"/>
+        </w:rPr>
+      </w:pPr>
+    </w:p>
+    <w:p>
+      <w:pPr>
+        <w:rPr>
+          <w:lang w:val="en-GB"/>
+        </w:rPr>
+      </w:pPr>
+    </w:p>
+    <w:p>
+      <w:pPr>
+        <w:rPr>
+          <w:lang w:val="en-GB"/>
+        </w:rPr>
+      </w:pPr>
     </w:p>
     <w:p>
       <w:pPr>

</xml_diff>